<commit_message>
docs: add search algorithm details to SmartMed report
- Included an explanation of the linear search algorithm used for in-memory catalogue and grid lookups in SmartMed, detailing its implementation in SearchService.cs.
- Clarified the rationale for choosing linear search over binary search, emphasizing its suitability for partial text matching in pharmacy catalogues.
- Documented the search process across various services, including MedicineService and CustomerService, to enhance understanding of the search functionality within the application.
</commit_message>
<xml_diff>
--- a/Docs/Report/SmartMed Report Sample.docx
+++ b/Docs/Report/SmartMed Report Sample.docx
@@ -4876,6 +4876,100 @@
           <w:sz w:val="24"/>
         </w:rPr>
         <w:t>[Insert screenshot of this interface here]</w:t>
+      </w:r>
+    </w:p>
+    <w:p>
+      <w:pPr>
+        <w:pStyle w:val="Heading1"/>
+      </w:pPr>
+      <w:r>
+        <w:t>Search Algorithms</w:t>
+      </w:r>
+    </w:p>
+    <w:p>
+      <w:pPr>
+        <w:pStyle w:val="BodyText"/>
+        <w:spacing w:line="360" w:lineRule="auto"/>
+      </w:pPr>
+      <w:r>
+        <w:rPr>
+          <w:rFonts w:ascii="Times New Roman" w:hAnsi="Times New Roman"/>
+          <w:sz w:val="24"/>
+        </w:rPr>
+        <w:t>SmartMed uses linear (sequential) search for all in-memory catalogue and grid lookups. The algorithm is implemented in SearchService.cs. It walks a list from the first element to the last and adds matching items to a result list. In the worst case every item is examined, so the time complexity is O(n) for a list of n records.</w:t>
+      </w:r>
+    </w:p>
+    <w:p>
+      <w:pPr>
+        <w:pStyle w:val="BodyText"/>
+        <w:spacing w:line="360" w:lineRule="auto"/>
+      </w:pPr>
+      <w:r>
+        <w:rPr>
+          <w:rFonts w:ascii="Times New Roman" w:hAnsi="Times New Roman"/>
+          <w:sz w:val="24"/>
+        </w:rPr>
+        <w:t>Linear search was chosen because pharmacy catalogues are typically modest in size, and users need partial text matching (for example finding "Para" inside "Paracetamol"). Binary search would require a sorted collection and exact key comparison; it is unsuitable for case-insensitive substring matching on medicine names, categories, or customer contact fields without rebuilding sorted indexes for every filter.</w:t>
+      </w:r>
+    </w:p>
+    <w:p>
+      <w:pPr>
+        <w:pStyle w:val="BodyText"/>
+        <w:spacing w:line="360" w:lineRule="auto"/>
+      </w:pPr>
+      <w:r>
+        <w:rPr>
+          <w:rFonts w:ascii="Times New Roman" w:hAnsi="Times New Roman"/>
+          <w:sz w:val="24"/>
+        </w:rPr>
+        <w:t>SearchService.SearchByName compares each MedicineName with String.Contains after normalising to lower case. FilterByCategory and FilterByPriceRange apply the same sequential style for category text and price bounds. Search combines these passes in order: name, then category, then price. SearchCustomers applies the same linear pattern across customer identifier, name, email, and phone. SearchOrders provides an equivalent linear scan over order references, customer name, and status.</w:t>
+      </w:r>
+    </w:p>
+    <w:p>
+      <w:pPr>
+        <w:pStyle w:val="BodyText"/>
+        <w:spacing w:line="360" w:lineRule="auto"/>
+      </w:pPr>
+      <w:r>
+        <w:rPr>
+          <w:rFonts w:ascii="Times New Roman" w:hAnsi="Times New Roman"/>
+          <w:sz w:val="24"/>
+        </w:rPr>
+        <w:t>MedicineService.Search and SearchForCustomers call SearchService.Search so both admin Manage Medicines and customer Search Medicines screens share one algorithm. CustomerService uses SearchCustomers for admin customer lookup. This single service keeps the coursework search requirement clear, testable, and documented in one place.</w:t>
+      </w:r>
+    </w:p>
+    <w:p>
+      <w:pPr>
+        <w:pStyle w:val="BodyText"/>
+        <w:spacing w:line="360" w:lineRule="auto"/>
+      </w:pPr>
+      <w:r>
+        <w:rPr>
+          <w:rFonts w:ascii="Times New Roman" w:hAnsi="Times New Roman"/>
+          <w:sz w:val="24"/>
+        </w:rPr>
+        <w:t>Representative logic (SearchService.SearchByName):</w:t>
+      </w:r>
+    </w:p>
+    <w:p>
+      <w:pPr>
+        <w:pStyle w:val="BodyText"/>
+        <w:spacing w:line="360" w:lineRule="auto"/>
+      </w:pPr>
+      <w:r>
+        <w:rPr>
+          <w:rFonts w:ascii="Times New Roman" w:hAnsi="Times New Roman"/>
+          <w:sz w:val="24"/>
+        </w:rPr>
+        <w:t>foreach (var medicine in medicines)</w:t>
+        <w:br/>
+        <w:t>{</w:t>
+        <w:br/>
+        <w:t xml:space="preserve">    if (medicine.MedicineName.ToLower().Contains(key))</w:t>
+        <w:br/>
+        <w:t xml:space="preserve">        results.Add(medicine);</w:t>
+        <w:br/>
+        <w:t>}</w:t>
       </w:r>
     </w:p>
     <w:p>

</xml_diff>